<commit_message>
Align write-up with final presentation script
Adds target segments and market data, the three-tier business model, privacy and data handling, the card-swipe quiz, and next steps (photo recognition, coffee community).

Co-Authored-By: Claude Opus 5.5 (1M context) <noreply@anthropic.com>
Claude-Session: https://claude.ai/code/session_015j5FFmfLozUT6QMwdn8kUD
</commit_message>
<xml_diff>
--- a/writeup.docx
+++ b/writeup.docx
@@ -2,7 +2,7 @@
 <file path=word/document.xml><?xml version="1.0" encoding="utf-8"?>
 <w:document xmlns:w="http://schemas.openxmlformats.org/wordprocessingml/2006/main" xmlns:m="http://schemas.openxmlformats.org/officeDocument/2006/math" xmlns:r="http://schemas.openxmlformats.org/officeDocument/2006/relationships" xmlns:o="urn:schemas-microsoft-com:office:office" xmlns:v="urn:schemas-microsoft-com:vml" xmlns:w10="urn:schemas-microsoft-com:office:word" xmlns:a="http://schemas.openxmlformats.org/drawingml/2006/main" xmlns:pic="http://schemas.openxmlformats.org/drawingml/2006/picture" xmlns:wp="http://schemas.openxmlformats.org/drawingml/2006/wordprocessingDrawing">
   <w:body>
-    <w:bookmarkStart w:id="32" w:name="Xa5a2fe2d5362864ca6aaff1fd5d0d048c350a08"/>
+    <w:bookmarkStart w:id="33" w:name="Xa5a2fe2d5362864ca6aaff1fd5d0d048c350a08"/>
     <w:p>
       <w:pPr>
         <w:pStyle w:val="Heading1"/>
@@ -97,7 +97,52 @@
         <w:pStyle w:val="FirstParagraph"/>
       </w:pPr>
       <w:r>
-        <w:t xml:space="preserve">Our target user is the everyday coffee drinker who orders a latte or buys a bag of beans each week and wants to branch out, but does not speak the language of origins, processing methods, or tasting notes. They describe coffee the way they experience it:</w:t>
+        <w:t xml:space="preserve">For some people coffee is a daily morning necessity; for others it is a hobby worth studying. We serve both. The</w:t>
+      </w:r>
+      <w:r>
+        <w:t xml:space="preserve"> </w:t>
+      </w:r>
+      <w:r>
+        <w:rPr>
+          <w:bCs/>
+          <w:b/>
+        </w:rPr>
+        <w:t xml:space="preserve">daily drinker</w:t>
+      </w:r>
+      <w:r>
+        <w:t xml:space="preserve"> </w:t>
+      </w:r>
+      <w:r>
+        <w:t xml:space="preserve">orders the same iced Americano every morning and wants a little variety without gambling on a cup they will not like. The</w:t>
+      </w:r>
+      <w:r>
+        <w:t xml:space="preserve"> </w:t>
+      </w:r>
+      <w:r>
+        <w:rPr>
+          <w:bCs/>
+          <w:b/>
+        </w:rPr>
+        <w:t xml:space="preserve">explorer</w:t>
+      </w:r>
+      <w:r>
+        <w:t xml:space="preserve"> </w:t>
+      </w:r>
+      <w:r>
+        <w:t xml:space="preserve">wants niche origins and new varieties, and wants to know why each one is worth trying. A third group,</w:t>
+      </w:r>
+      <w:r>
+        <w:t xml:space="preserve"> </w:t>
+      </w:r>
+      <w:r>
+        <w:rPr>
+          <w:bCs/>
+          <w:b/>
+        </w:rPr>
+        <w:t xml:space="preserve">coffee travelers</w:t>
+      </w:r>
+      <w:r>
+        <w:t xml:space="preserve">, plans trips around where coffee grows. Most of them do not speak the language of origins, processing methods, or tasting notes; they describe coffee the way they experience it:</w:t>
       </w:r>
       <w:r>
         <w:t xml:space="preserve"> </w:t>
@@ -134,6 +179,33 @@
       </w:r>
       <w:r>
         <w:t xml:space="preserve">”</w:t>
+      </w:r>
+      <w:r>
+        <w:t xml:space="preserve"> </w:t>
+      </w:r>
+      <w:r>
+        <w:t xml:space="preserve">For all of them, Coffee Atlas is meant to be a personalized coffee recommendation and tasting plan.</w:t>
+      </w:r>
+    </w:p>
+    <w:p>
+      <w:pPr>
+        <w:pStyle w:val="BodyText"/>
+      </w:pPr>
+      <w:r>
+        <w:t xml:space="preserve">The market is large: 66% of U.S. adults drink coffee every day, and 46% had a specialty coffee in the past day (NCA and SCA,</w:t>
+      </w:r>
+      <w:r>
+        <w:t xml:space="preserve"> </w:t>
+      </w:r>
+      <w:r>
+        <w:rPr>
+          <w:iCs/>
+          <w:i/>
+        </w:rPr>
+        <w:t xml:space="preserve">National Coffee Data Trends</w:t>
+      </w:r>
+      <w:r>
+        <w:t xml:space="preserve">, 2025). Yet the usual alternatives each miss something: roaster websites only sell their own beans, review and map apps rate places rather than personal taste, and general AI chatbots have no sourced catalog and can invent coffees.</w:t>
       </w:r>
     </w:p>
     <w:p>
@@ -190,7 +262,7 @@
     </w:p>
     <w:bookmarkEnd w:id="21"/>
     <w:bookmarkEnd w:id="22"/>
-    <w:bookmarkStart w:id="23" w:name="solution-and-user-journey"/>
+    <w:bookmarkStart w:id="24" w:name="solution-and-user-journey"/>
     <w:p>
       <w:pPr>
         <w:pStyle w:val="Heading2"/>
@@ -238,7 +310,7 @@
         <w:t xml:space="preserve">Find your coffee</w:t>
       </w:r>
       <w:r>
-        <w:t xml:space="preserve">, users describe acidity, sweetness, roast, milk, flavors, preparation methods, and optional notes. AI selects eligible catalog items and explains their fit and trade-offs.</w:t>
+        <w:t xml:space="preserve">, users answer a short card-swipe quiz: one near-full-page card per option for acidity, sweetness, roast, and milk, head-to-head rounds that rank flavors, then preparation methods and optional notes. Any question can be skipped, and the full one-page form remains available as a preference editor. AI selects eligible catalog items and explains their fit and trade-offs.</w:t>
       </w:r>
       <w:r>
         <w:t xml:space="preserve"> </w:t>
@@ -281,8 +353,74 @@
         <w:t xml:space="preserve">unlocks unlimited recommendations without moving real money. Trips currently remain outside the payment gate and do not consume recommendation credits; a server setting can include them in the same paid entitlement. Preferences, saved items, and paid access persist after logout and login.</w:t>
       </w:r>
     </w:p>
+    <w:bookmarkStart w:id="23" w:name="business-model"/>
+    <w:p>
+      <w:pPr>
+        <w:pStyle w:val="Heading3"/>
+      </w:pPr>
+      <w:r>
+        <w:t xml:space="preserve">Business model</w:t>
+      </w:r>
+    </w:p>
+    <w:p>
+      <w:pPr>
+        <w:pStyle w:val="FirstParagraph"/>
+      </w:pPr>
+      <w:r>
+        <w:t xml:space="preserve">The pricing has three tiers so that each customer can choose the version that matches how much they value the product, a form of second-degree price discrimination.</w:t>
+      </w:r>
+      <w:r>
+        <w:t xml:space="preserve"> </w:t>
+      </w:r>
+      <w:r>
+        <w:rPr>
+          <w:bCs/>
+          <w:b/>
+        </w:rPr>
+        <w:t xml:space="preserve">Free</w:t>
+      </w:r>
+      <w:r>
+        <w:t xml:space="preserve"> </w:t>
+      </w:r>
+      <w:r>
+        <w:t xml:space="preserve">covers the globe, every catalog profile, and three AI recommendations. The</w:t>
+      </w:r>
+      <w:r>
+        <w:t xml:space="preserve"> </w:t>
+      </w:r>
+      <w:r>
+        <w:rPr>
+          <w:bCs/>
+          <w:b/>
+        </w:rPr>
+        <w:t xml:space="preserve">lifetime unlock</w:t>
+      </w:r>
+      <w:r>
+        <w:t xml:space="preserve"> </w:t>
+      </w:r>
+      <w:r>
+        <w:t xml:space="preserve">is the $5 one-time payment described above and is live today. A</w:t>
+      </w:r>
+      <w:r>
+        <w:t xml:space="preserve"> </w:t>
+      </w:r>
+      <w:r>
+        <w:rPr>
+          <w:bCs/>
+          <w:b/>
+        </w:rPr>
+        <w:t xml:space="preserve">monthly Atlas Pro</w:t>
+      </w:r>
+      <w:r>
+        <w:t xml:space="preserve"> </w:t>
+      </w:r>
+      <w:r>
+        <w:t xml:space="preserve">plan (planned, about $2.99/month) would add unlimited trips and new AI features first; the server switch that can place trips behind payment is already in place. Serving costs stay low because the map uses open-source MapLibre with no per-visit fee and the AI model is called only when a user asks.</w:t>
+      </w:r>
+    </w:p>
     <w:bookmarkEnd w:id="23"/>
-    <w:bookmarkStart w:id="24" w:name="architecture-and-key-decisions"/>
+    <w:bookmarkEnd w:id="24"/>
+    <w:bookmarkStart w:id="25" w:name="architecture-and-key-decisions"/>
     <w:p>
       <w:pPr>
         <w:pStyle w:val="Heading2"/>
@@ -365,7 +503,7 @@
         <w:t xml:space="preserve"> </w:t>
       </w:r>
       <w:r>
-        <w:t xml:space="preserve">in production and SQLite locally. This separation keeps editorial content consistent across maps and AI results while allowing geographic browsing independently of the user database. Passwords use scrypt hashing; cookie-based sessions identify users, and server queries enforce ownership of preferences and saved items.</w:t>
+        <w:t xml:space="preserve">in production and SQLite locally. This separation keeps editorial content consistent across maps and AI results while allowing geographic browsing independently of the user database. Passwords use salted scrypt hashing; HttpOnly cookie-based sessions identify users, and server queries enforce ownership of preferences and saved items. We store only what personalization needs (email, preferences, saved items, and payment status); card details are entered on Stripe’s hosted checkout and never reach our servers. Prompts sent to the model contain taste preferences, notes, and catalog candidates, never the user’s name or email.</w:t>
       </w:r>
     </w:p>
     <w:p>
@@ -413,8 +551,8 @@
         <w:t xml:space="preserve">collects a simulated payment, and a signed, verified webhook grants the entitlement; returning to the website alone does not unlock access. Duplicate events are handled idempotently. Recommendation credits are claimed atomically only for validated results containing matches. Provider credentials remain on the server.</w:t>
       </w:r>
     </w:p>
-    <w:bookmarkEnd w:id="24"/>
-    <w:bookmarkStart w:id="25" w:name="implementation-deployment-and-validation"/>
+    <w:bookmarkEnd w:id="25"/>
+    <w:bookmarkStart w:id="26" w:name="implementation-deployment-and-validation"/>
     <w:p>
       <w:pPr>
         <w:pStyle w:val="Heading2"/>
@@ -472,7 +610,7 @@
           <w:bCs/>
           <w:b/>
         </w:rPr>
-        <w:t xml:space="preserve">14 pages</w:t>
+        <w:t xml:space="preserve">15 pages</w:t>
       </w:r>
       <w:r>
         <w:t xml:space="preserve">. Tests cover account persistence, catalog integrity, invalid model output, quota enforcement, and payment events.</w:t>
@@ -521,8 +659,8 @@
         <w:t xml:space="preserve">On October 21, the team completed the public-site walkthrough and reported all steps passing: browsing, signup, saving, preference persistence, AI recommendations, trip generation, sandbox checkout, and retained data/access after re-login, including another recommendation after payment. Separately, a hosted Stripe checkout was verified to unlock access through its webhook. These results establish the working functional journey; broader quality and performance evaluation remains future work.</w:t>
       </w:r>
     </w:p>
-    <w:bookmarkEnd w:id="25"/>
-    <w:bookmarkStart w:id="26" w:name="lessons-learned"/>
+    <w:bookmarkEnd w:id="26"/>
+    <w:bookmarkStart w:id="27" w:name="lessons-learned"/>
     <w:p>
       <w:pPr>
         <w:pStyle w:val="Heading2"/>
@@ -678,14 +816,22 @@
         <w:t xml:space="preserve">Tests with controlled model responses prove error handling and access rules; only the public-site walkthrough proved that hosting, database, AI provider, and Stripe worked together.</w:t>
       </w:r>
     </w:p>
-    <w:bookmarkEnd w:id="26"/>
-    <w:bookmarkStart w:id="31" w:name="next-steps"/>
+    <w:bookmarkEnd w:id="27"/>
+    <w:bookmarkStart w:id="32" w:name="next-steps"/>
     <w:p>
       <w:pPr>
         <w:pStyle w:val="Heading2"/>
       </w:pPr>
       <w:r>
         <w:t xml:space="preserve">6. Next Steps</w:t>
+      </w:r>
+    </w:p>
+    <w:p>
+      <w:pPr>
+        <w:pStyle w:val="FirstParagraph"/>
+      </w:pPr>
+      <w:r>
+        <w:t xml:space="preserve">Our direction comes from one idea: other coffee sites recommend what is popular; Coffee Atlas should be about the individual user.</w:t>
       </w:r>
     </w:p>
     <w:p>
@@ -697,7 +843,17 @@
         <w:pStyle w:val="Compact"/>
       </w:pPr>
       <w:r>
-        <w:t xml:space="preserve">Evaluate recommendation relevance with users and a repeatable preference test set, including contradictory requests.</w:t>
+        <w:rPr>
+          <w:bCs/>
+          <w:b/>
+        </w:rPr>
+        <w:t xml:space="preserve">Photo recognition:</w:t>
+      </w:r>
+      <w:r>
+        <w:t xml:space="preserve"> </w:t>
+      </w:r>
+      <w:r>
+        <w:t xml:space="preserve">photograph a bag of coffee in a store and get its origin, flavor profile, and fit with the user’s taste, saved to a personal coffee archive.</w:t>
       </w:r>
     </w:p>
     <w:p>
@@ -709,7 +865,17 @@
         <w:pStyle w:val="Compact"/>
       </w:pPr>
       <w:r>
-        <w:t xml:space="preserve">Improve trip ordering and overlapping map pins, while making the itinerary’s discovery purpose clear.</w:t>
+        <w:rPr>
+          <w:bCs/>
+          <w:b/>
+        </w:rPr>
+        <w:t xml:space="preserve">Coffee community:</w:t>
+      </w:r>
+      <w:r>
+        <w:t xml:space="preserve"> </w:t>
+      </w:r>
+      <w:r>
+        <w:t xml:space="preserve">a forum where users rate and review beans and drinks.</w:t>
       </w:r>
     </w:p>
     <w:p>
@@ -721,7 +887,7 @@
         <w:pStyle w:val="Compact"/>
       </w:pPr>
       <w:r>
-        <w:t xml:space="preserve">Expand sourced tasting information and prefilter candidates as the catalog grows to control AI latency and cost.</w:t>
+        <w:t xml:space="preserve">Add one-click export and deletion of account data before a public launch.</w:t>
       </w:r>
     </w:p>
     <w:p>
@@ -733,6 +899,42 @@
         <w:pStyle w:val="Compact"/>
       </w:pPr>
       <w:r>
+        <w:t xml:space="preserve">Evaluate recommendation relevance with users and a repeatable preference test set, including contradictory requests.</w:t>
+      </w:r>
+    </w:p>
+    <w:p>
+      <w:pPr>
+        <w:numPr>
+          <w:ilvl w:val="0"/>
+          <w:numId w:val="1002"/>
+        </w:numPr>
+        <w:pStyle w:val="Compact"/>
+      </w:pPr>
+      <w:r>
+        <w:t xml:space="preserve">Improve trip ordering and overlapping map pins, while making the itinerary’s discovery purpose clear.</w:t>
+      </w:r>
+    </w:p>
+    <w:p>
+      <w:pPr>
+        <w:numPr>
+          <w:ilvl w:val="0"/>
+          <w:numId w:val="1002"/>
+        </w:numPr>
+        <w:pStyle w:val="Compact"/>
+      </w:pPr>
+      <w:r>
+        <w:t xml:space="preserve">Expand sourced tasting information and prefilter candidates as the catalog grows to control AI latency and cost.</w:t>
+      </w:r>
+    </w:p>
+    <w:p>
+      <w:pPr>
+        <w:numPr>
+          <w:ilvl w:val="0"/>
+          <w:numId w:val="1002"/>
+        </w:numPr>
+        <w:pStyle w:val="Compact"/>
+      </w:pPr>
+      <w:r>
         <w:t xml:space="preserve">Add account recovery, stronger abuse controls, operational monitoring, and refund/dispute support before wider commercial use.</w:t>
       </w:r>
     </w:p>
@@ -746,7 +948,7 @@
       <w:r>
         <w:t xml:space="preserve"> </w:t>
       </w:r>
-      <w:hyperlink r:id="rId27">
+      <w:hyperlink r:id="rId28">
         <w:r>
           <w:rPr>
             <w:rStyle w:val="Hyperlink"/>
@@ -760,7 +962,7 @@
       <w:r>
         <w:t xml:space="preserve"> </w:t>
       </w:r>
-      <w:hyperlink r:id="rId28">
+      <w:hyperlink r:id="rId29">
         <w:r>
           <w:rPr>
             <w:rStyle w:val="Hyperlink"/>
@@ -774,7 +976,7 @@
       <w:r>
         <w:t xml:space="preserve"> </w:t>
       </w:r>
-      <w:hyperlink r:id="rId29">
+      <w:hyperlink r:id="rId30">
         <w:r>
           <w:rPr>
             <w:rStyle w:val="Hyperlink"/>
@@ -788,7 +990,7 @@
       <w:r>
         <w:t xml:space="preserve"> </w:t>
       </w:r>
-      <w:hyperlink r:id="rId30">
+      <w:hyperlink r:id="rId31">
         <w:r>
           <w:rPr>
             <w:rStyle w:val="Hyperlink"/>
@@ -800,8 +1002,8 @@
         <w:t xml:space="preserve">.</w:t>
       </w:r>
     </w:p>
-    <w:bookmarkEnd w:id="31"/>
     <w:bookmarkEnd w:id="32"/>
+    <w:bookmarkEnd w:id="33"/>
     <w:sectPr/>
   </w:body>
 </w:document>

</xml_diff>